<commit_message>
Mods to Pause/Contiue behavior. Removed part of display of version info modified by MS Store
</commit_message>
<xml_diff>
--- a/SimpleSlide/Assets/Description.docx
+++ b/SimpleSlide/Assets/Description.docx
@@ -19,54 +19,28 @@
         <w:t xml:space="preserve"> and/or videos</w:t>
       </w:r>
       <w:r>
-        <w:t>. Many people collect picture files (</w:t>
-      </w:r>
-      <w:proofErr w:type="spellStart"/>
-      <w:r>
-        <w:t>eg</w:t>
-      </w:r>
-      <w:proofErr w:type="spellEnd"/>
-      <w:r>
-        <w:t xml:space="preserve"> .</w:t>
-      </w:r>
-      <w:proofErr w:type="spellStart"/>
-      <w:r>
-        <w:t>jpg’s</w:t>
-      </w:r>
-      <w:proofErr w:type="spellEnd"/>
-      <w:r>
-        <w:t xml:space="preserve">) </w:t>
+        <w:t xml:space="preserve">. Many people collect picture files (eg .jpg’s) </w:t>
       </w:r>
       <w:r>
         <w:t xml:space="preserve">and videos (e .mp4’s) </w:t>
       </w:r>
       <w:r>
-        <w:t xml:space="preserve">organized as a collection of hierarchical folders, maybe under a main folder called Pictures with sub-folders like '4th of July 2022' or 'Mom’s </w:t>
-      </w:r>
-      <w:proofErr w:type="spellStart"/>
-      <w:r>
-        <w:t>BDay</w:t>
-      </w:r>
-      <w:proofErr w:type="spellEnd"/>
-      <w:r>
-        <w:t xml:space="preserve"> 2019'. These are often backed-up/replicated onto external USB storage device that can be plugged into an Xbox or PC.</w:t>
+        <w:t>organized as a collection of hierarchical folders, maybe under a main folder called Pictures with sub-folders like '4th of July 2022' or 'Mom’s BDay 2019'. These are often backed-up/replicated onto external USB storage device that can be plugged into an Xbox or PC.</w:t>
       </w:r>
     </w:p>
     <w:p>
       <w:r>
-        <w:t>-</w:t>
-      </w:r>
-      <w:r>
-        <w:tab/>
+        <w:t xml:space="preserve">- </w:t>
+      </w:r>
+      <w:r>
         <w:t>There can be thousands or tens of thousands or more of these files in a collection.</w:t>
       </w:r>
     </w:p>
     <w:p>
       <w:r>
-        <w:t>-</w:t>
-      </w:r>
-      <w:r>
-        <w:tab/>
+        <w:t xml:space="preserve">- </w:t>
+      </w:r>
+      <w:r>
         <w:t>Start from any folder, play the pictures</w:t>
       </w:r>
       <w:r>
@@ -78,79 +52,63 @@
     </w:p>
     <w:p>
       <w:r>
-        <w:t>-</w:t>
-      </w:r>
-      <w:r>
-        <w:tab/>
+        <w:t xml:space="preserve">- </w:t>
+      </w:r>
+      <w:r>
         <w:t>Remember where the slide show was when the app is stopped and pick up from there when the app is opened again.</w:t>
       </w:r>
     </w:p>
     <w:p>
       <w:r>
-        <w:t>-</w:t>
-      </w:r>
-      <w:r>
-        <w:tab/>
-        <w:t>Ability to use left/right arrows/</w:t>
-      </w:r>
-      <w:proofErr w:type="spellStart"/>
-      <w:r>
-        <w:t>DPad</w:t>
-      </w:r>
-      <w:proofErr w:type="spellEnd"/>
-      <w:r>
-        <w:t xml:space="preserve"> to move through the pictures.</w:t>
+        <w:t xml:space="preserve">- </w:t>
+      </w:r>
+      <w:r>
+        <w:t>Ability to use left/right arrows/DPad to move through the pictures.</w:t>
       </w:r>
     </w:p>
     <w:p>
       <w:r>
-        <w:t>-</w:t>
-      </w:r>
-      <w:r>
-        <w:tab/>
+        <w:t xml:space="preserve">- </w:t>
+      </w:r>
+      <w:r>
         <w:t>Use</w:t>
       </w:r>
       <w:r>
         <w:t xml:space="preserve"> </w:t>
+      </w:r>
+      <w:r>
+        <w:t xml:space="preserve">Shift+arrows or L/R bumper </w:t>
+      </w:r>
+      <w:r>
+        <w:t>t</w:t>
+      </w:r>
+      <w:r>
+        <w:t>o move to previous/next folder</w:t>
+      </w:r>
+    </w:p>
+    <w:p>
+      <w:r>
+        <w:t xml:space="preserve">- </w:t>
+      </w:r>
+      <w:r>
+        <w:t>Pause/Continue slide show</w:t>
+      </w:r>
+    </w:p>
+    <w:p>
+      <w:r>
+        <w:t xml:space="preserve">- </w:t>
+      </w:r>
+      <w:r>
+        <w:t>Adjust speed of slide show with up/down arrow/DPad.</w:t>
+      </w:r>
+    </w:p>
+    <w:p>
+      <w:r>
+        <w:t xml:space="preserve">- </w:t>
       </w:r>
       <w:bookmarkStart w:id="0" w:name="_GoBack"/>
       <w:bookmarkEnd w:id="0"/>
       <w:r>
-        <w:t>Shift+arrows or L/R bumper o move to previous/next folder</w:t>
-      </w:r>
-    </w:p>
-    <w:p>
-      <w:r>
-        <w:t>-</w:t>
-      </w:r>
-      <w:r>
-        <w:tab/>
-        <w:t>Pause/Continue slide show</w:t>
-      </w:r>
-    </w:p>
-    <w:p>
-      <w:r>
-        <w:t>-</w:t>
-      </w:r>
-      <w:r>
-        <w:tab/>
-        <w:t>Adjust speed of slide show with up/down arrow/</w:t>
-      </w:r>
-      <w:proofErr w:type="spellStart"/>
-      <w:r>
-        <w:t>DPad</w:t>
-      </w:r>
-      <w:proofErr w:type="spellEnd"/>
-      <w:r>
-        <w:t>.</w:t>
-      </w:r>
-    </w:p>
-    <w:p>
-      <w:r>
-        <w:t>-</w:t>
-      </w:r>
-      <w:r>
-        <w:tab/>
         <w:t>At end of all the pictures</w:t>
       </w:r>
       <w:r>

</xml_diff>